<commit_message>
Site updated: 2022-03-16 09:18:10
</commit_message>
<xml_diff>
--- a/treasure/download/02续藏经-710部/新建文件夹/中国撰述诸宗著述部禅宗杂著-达磨大师破相论-梁-菩提达磨.docx
+++ b/treasure/download/02续藏经-710部/新建文件夹/中国撰述诸宗著述部禅宗杂著-达磨大师破相论-梁-菩提达磨.docx
@@ -1992,7 +1992,19 @@
           <w:shd w:val="pct15" w:color="auto" w:fill="FFFFFF"/>
           <w:lang w:eastAsia="zh-CN"/>
         </w:rPr>
-        <w:t>名为礼拜。其相即法相也。世尊欲令世俗表谦下心。亦为礼拜。故须屈伏外身示内恭敬。举外明内。性相相应。若复不行理法。唯执外求</w:t>
+        <w:t>名为礼拜。其相即法相也。世尊欲令世俗表谦下心。亦为礼拜。故须屈伏外身示内恭敬。举外明内。性相相应。</w:t>
+      </w:r>
+      <w:bookmarkStart w:id="0" w:name="_GoBack"/>
+      <w:bookmarkEnd w:id="0"/>
+      <w:r>
+        <w:rPr>
+          <w:rFonts w:hint="eastAsia"/>
+          <w:sz w:val="24"/>
+          <w:szCs w:val="24"/>
+          <w:shd w:val="pct15" w:color="auto" w:fill="FFFFFF"/>
+          <w:lang w:eastAsia="zh-CN"/>
+        </w:rPr>
+        <w:t>若复不行理法。唯执外求</w:t>
       </w:r>
       <w:r>
         <w:rPr>
@@ -2004,6 +2016,130 @@
         </w:rPr>
         <w:lastRenderedPageBreak/>
         <w:t>内。则放纵瞋痴常为恶业。外即空劳身相。诈现威仪。无惭于圣。徒诳于凡。不免轮回。岂成功德。</w:t>
+      </w:r>
+    </w:p>
+    <w:p>
+      <w:pPr>
+        <w:spacing w:after="0" w:line="240" w:lineRule="auto"/>
+        <w:ind w:firstLine="480"/>
+        <w:jc w:val="both"/>
+        <w:rPr>
+          <w:sz w:val="24"/>
+          <w:szCs w:val="24"/>
+          <w:shd w:val="pct15" w:color="auto" w:fill="FFFFFF"/>
+        </w:rPr>
+      </w:pPr>
+      <w:r>
+        <w:rPr>
+          <w:rFonts w:hint="eastAsia"/>
+          <w:sz w:val="24"/>
+          <w:szCs w:val="24"/>
+          <w:shd w:val="pct15" w:color="auto" w:fill="FFFFFF"/>
+          <w:lang w:eastAsia="zh-CN"/>
+        </w:rPr>
+        <w:t>问。如温室经说。洗浴众僧获福无量。此则凭于事法。功德始成。若为观心可相应否。</w:t>
+      </w:r>
+    </w:p>
+    <w:p>
+      <w:pPr>
+        <w:spacing w:after="0" w:line="240" w:lineRule="auto"/>
+        <w:ind w:firstLine="480"/>
+        <w:jc w:val="both"/>
+        <w:rPr>
+          <w:sz w:val="24"/>
+          <w:szCs w:val="24"/>
+          <w:shd w:val="pct15" w:color="auto" w:fill="FFFFFF"/>
+        </w:rPr>
+      </w:pPr>
+      <w:r>
+        <w:rPr>
+          <w:rFonts w:hint="eastAsia"/>
+          <w:sz w:val="24"/>
+          <w:szCs w:val="24"/>
+          <w:shd w:val="pct15" w:color="auto" w:fill="FFFFFF"/>
+          <w:lang w:eastAsia="zh-CN"/>
+        </w:rPr>
+        <w:t>答。洗浴众僧者。非洗世间有为事也。世尊当尔为诸弟子说温室经。欲令受持洗浴之法。故假世事比喻真宗。隐说七事供养功德。其七事云何。一者净水。二者烧火。三者澡豆。四者杨枝。五者净灰。六者苏犒。七者内衣。与此七法喻于七事。一切众生由此七法。沐浴庄严。能除毒心无明垢秽。其七法者。一</w:t>
+      </w:r>
+      <w:r>
+        <w:rPr>
+          <w:rFonts w:hint="eastAsia"/>
+          <w:sz w:val="24"/>
+          <w:szCs w:val="24"/>
+          <w:shd w:val="pct15" w:color="auto" w:fill="FFFFFF"/>
+          <w:lang w:eastAsia="zh-CN"/>
+        </w:rPr>
+        <w:t>者谓净戒。洗荡僭非。犹如净水濯诸尘垢。二者智慧。观察内外。由如燃</w:t>
+      </w:r>
+      <w:r>
+        <w:rPr>
+          <w:rFonts w:hint="eastAsia"/>
+          <w:sz w:val="24"/>
+          <w:szCs w:val="24"/>
+          <w:shd w:val="pct15" w:color="auto" w:fill="FFFFFF"/>
+          <w:lang w:eastAsia="zh-CN"/>
+        </w:rPr>
+        <w:t>火能温净水。三者分别。简弃诸恶。犹如澡豆能净垢腻。四者真实。断诸妄想。如嚼杨枝能净口气。五者正信。决定无疑。由如净灰摩身能辟诸风。六者谓柔和忍辱。由如苏犒通润皮肤。七者谓惭愧。悔诸恶业。犹如内衣遮丑形体。如上七法是经中秘密之义。如来当尔为诸大乘利根者说。非为小智下劣凡夫。所以今人无能解悟。其温室者即身是也。所以燃智慧火、温净戒汤。沐浴身中真如佛性。受持七法以自庄严。当尔比丘聪明上智皆悟圣意</w:t>
+      </w:r>
+      <w:r>
+        <w:rPr>
+          <w:rFonts w:hint="eastAsia"/>
+          <w:sz w:val="24"/>
+          <w:szCs w:val="24"/>
+          <w:shd w:val="pct15" w:color="auto" w:fill="FFFFFF"/>
+          <w:lang w:eastAsia="zh-CN"/>
+        </w:rPr>
+        <w:t>，</w:t>
+      </w:r>
+      <w:r>
+        <w:rPr>
+          <w:rFonts w:hint="eastAsia"/>
+          <w:sz w:val="24"/>
+          <w:szCs w:val="24"/>
+          <w:shd w:val="pct15" w:color="auto" w:fill="FFFFFF"/>
+          <w:lang w:eastAsia="zh-CN"/>
+        </w:rPr>
+        <w:t>如说修行</w:t>
+      </w:r>
+      <w:r>
+        <w:rPr>
+          <w:rFonts w:hint="eastAsia"/>
+          <w:sz w:val="24"/>
+          <w:szCs w:val="24"/>
+          <w:shd w:val="pct15" w:color="auto" w:fill="FFFFFF"/>
+          <w:lang w:eastAsia="zh-CN"/>
+        </w:rPr>
+        <w:t>，</w:t>
+      </w:r>
+      <w:r>
+        <w:rPr>
+          <w:rFonts w:hint="eastAsia"/>
+          <w:sz w:val="24"/>
+          <w:szCs w:val="24"/>
+          <w:shd w:val="pct15" w:color="auto" w:fill="FFFFFF"/>
+          <w:lang w:eastAsia="zh-CN"/>
+        </w:rPr>
+        <w:t>功德成就俱登圣果。今时众生莫测其事。将世间水洗质碍身。自谓依经。岂非误也。且真如佛性非是凡形。烦恼尘垢本来无相。岂可将质碍水洗无为身。事不相应。云何悟道。若欲身得净者。当观此身本因贪欲不净所生。臭秽骈阗内外充满。若也洗此身求于净者。犹如</w:t>
+      </w:r>
+      <w:r>
+        <w:rPr>
+          <w:rFonts w:hint="eastAsia"/>
+          <w:sz w:val="24"/>
+          <w:szCs w:val="24"/>
+          <w:shd w:val="pct15" w:color="auto" w:fill="FFFFFF"/>
+          <w:lang w:eastAsia="zh-CN"/>
+        </w:rPr>
+        <w:t>洗堑，堑</w:t>
+      </w:r>
+      <w:r>
+        <w:rPr>
+          <w:rFonts w:hint="eastAsia"/>
+          <w:sz w:val="24"/>
+          <w:szCs w:val="24"/>
+          <w:shd w:val="pct15" w:color="auto" w:fill="FFFFFF"/>
+          <w:lang w:eastAsia="zh-CN"/>
+        </w:rPr>
+        <w:t>尽方净。以此验之。明知洗外非佛说也。</w:t>
       </w:r>
     </w:p>
     <w:p>
@@ -2024,7 +2160,7 @@
           <w:shd w:val="pct15" w:color="auto" w:fill="FFFFFF"/>
           <w:lang w:eastAsia="zh-CN"/>
         </w:rPr>
-        <w:t xml:space="preserve">　　问。如温室经说。洗浴众僧获福无量。此则凭于事法。功德始成。若为观心可相应否。</w:t>
+        <w:t xml:space="preserve">　　问。经说言。至心念佛必得往生西方净土。以此一门即应成佛。何假观心。求于解脱。</w:t>
       </w:r>
     </w:p>
     <w:p>
@@ -2045,27 +2181,7 @@
           <w:shd w:val="pct15" w:color="auto" w:fill="FFFFFF"/>
           <w:lang w:eastAsia="zh-CN"/>
         </w:rPr>
-        <w:t xml:space="preserve">　　答。洗浴众僧者。非洗世间有为事也。世尊当尔为诸弟子说温室经。欲令受持洗浴之法。故假世事比喻真宗。隐说七事供养功德。其七事云何。一者净水。二者烧火。三者澡豆。四者杨枝。五者净灰。六者苏犒。七者内衣。与此七法喻于七事。一切众生由此七法。沐浴庄严。能除毒心无明垢秽。其七法者。一</w:t>
-      </w:r>
-      <w:r>
-        <w:rPr>
-          <w:rFonts w:hint="eastAsia"/>
-          <w:sz w:val="24"/>
-          <w:szCs w:val="24"/>
-          <w:shd w:val="pct15" w:color="auto" w:fill="FFFFFF"/>
-          <w:lang w:eastAsia="zh-CN"/>
-        </w:rPr>
-        <w:t>者谓净戒。洗荡僭非。犹如净水濯诸尘垢。二者智慧。观察内外。由如燃</w:t>
-      </w:r>
-      <w:r>
-        <w:rPr>
-          <w:rFonts w:hint="eastAsia"/>
-          <w:sz w:val="24"/>
-          <w:szCs w:val="24"/>
-          <w:shd w:val="pct15" w:color="auto" w:fill="FFFFFF"/>
-          <w:lang w:eastAsia="zh-CN"/>
-        </w:rPr>
-        <w:t>火能温净水。三者分别。简弃诸恶。犹如澡豆能净垢腻。四者真实。断诸妄想。如嚼杨枝能净口气。五者正信。决定无疑。由如净灰摩身能辟诸风。六者谓柔和忍辱。由如苏犒通润皮肤。七者谓惭愧。悔诸恶业。犹如内衣遮丑形体。如上七法是经中秘密之义。如来当尔为诸大乘利根者说。非为小智下劣凡夫。所以今人无能解悟。其温室者即身是也。所以燃智慧火、温净戒汤。沐浴身中真如佛性。受持七法以自庄严。当尔比丘聪明上智皆悟圣意</w:t>
+        <w:t xml:space="preserve">　　答。夫念佛者当须正念。了义为正。不了义为邪。正念必得往生。邪念云何达彼。佛者觉也。所谓觉察身心勿令起恶。念者忆也。所谓忆持。戒行不忘精进勤了。如是义名为念。故知念在于心</w:t>
       </w:r>
       <w:r>
         <w:rPr>
@@ -2085,7 +2201,7 @@
           <w:shd w:val="pct15" w:color="auto" w:fill="FFFFFF"/>
           <w:lang w:eastAsia="zh-CN"/>
         </w:rPr>
-        <w:t>如说修行</w:t>
+        <w:t>不在于言。因筌求鱼，得鱼忘筌。因言求意，得意忘言。既称念佛之名，须知念佛之道。若心无实，口诵空名。三毒内臻，人我填臆。将无明心不见佛。徒尔费功。且如诵之与念。义理悬殊。在口曰诵</w:t>
       </w:r>
       <w:r>
         <w:rPr>
@@ -2105,69 +2221,7 @@
           <w:shd w:val="pct15" w:color="auto" w:fill="FFFFFF"/>
           <w:lang w:eastAsia="zh-CN"/>
         </w:rPr>
-        <w:t>功德成就俱登圣果。今时众生莫测其事。将世间水洗质碍身。自谓依经。岂非误也。且真如佛性非是凡形。烦恼尘垢本来无相。岂可将质碍水洗无为身。事不相应。云何悟道。若欲身得净者。当观此身本因贪欲不净所生。臭秽骈阗内外充满。若也洗此身求于净者。犹如</w:t>
-      </w:r>
-      <w:r>
-        <w:rPr>
-          <w:rFonts w:hint="eastAsia"/>
-          <w:sz w:val="24"/>
-          <w:szCs w:val="24"/>
-          <w:shd w:val="pct15" w:color="auto" w:fill="FFFFFF"/>
-          <w:lang w:eastAsia="zh-CN"/>
-        </w:rPr>
-        <w:t>洗堑，堑</w:t>
-      </w:r>
-      <w:r>
-        <w:rPr>
-          <w:rFonts w:hint="eastAsia"/>
-          <w:sz w:val="24"/>
-          <w:szCs w:val="24"/>
-          <w:shd w:val="pct15" w:color="auto" w:fill="FFFFFF"/>
-          <w:lang w:eastAsia="zh-CN"/>
-        </w:rPr>
-        <w:t>尽方净。以此验之。明知洗外非佛说也。</w:t>
-      </w:r>
-    </w:p>
-    <w:p>
-      <w:pPr>
-        <w:spacing w:after="0" w:line="240" w:lineRule="auto"/>
-        <w:jc w:val="both"/>
-        <w:rPr>
-          <w:sz w:val="24"/>
-          <w:szCs w:val="24"/>
-          <w:shd w:val="pct15" w:color="auto" w:fill="FFFFFF"/>
-        </w:rPr>
-      </w:pPr>
-      <w:r>
-        <w:rPr>
-          <w:rFonts w:hint="eastAsia"/>
-          <w:sz w:val="24"/>
-          <w:szCs w:val="24"/>
-          <w:shd w:val="pct15" w:color="auto" w:fill="FFFFFF"/>
-          <w:lang w:eastAsia="zh-CN"/>
-        </w:rPr>
-        <w:t xml:space="preserve">　　问。经说言。至心念佛必得往生西方净土。以此一门即应成佛。何假观心。求于解脱。</w:t>
-      </w:r>
-    </w:p>
-    <w:p>
-      <w:pPr>
-        <w:spacing w:after="0" w:line="240" w:lineRule="auto"/>
-        <w:jc w:val="both"/>
-        <w:rPr>
-          <w:sz w:val="24"/>
-          <w:szCs w:val="24"/>
-          <w:shd w:val="pct15" w:color="auto" w:fill="FFFFFF"/>
-        </w:rPr>
-      </w:pPr>
-      <w:r>
-        <w:rPr>
-          <w:rFonts w:hint="eastAsia"/>
-          <w:sz w:val="24"/>
-          <w:szCs w:val="24"/>
-          <w:shd w:val="pct15" w:color="auto" w:fill="FFFFFF"/>
-          <w:lang w:eastAsia="zh-CN"/>
-        </w:rPr>
-        <w:t xml:space="preserve">　　答。夫念佛者当须正念。了义为正。不了义为邪。正念必得往生。邪念云何达彼。佛者觉也。所谓觉察身心勿令起恶。念者忆也。所谓忆持。戒行不忘精进勤了。如是义名为念。故知念在于心</w:t>
+        <w:t>在心曰念。故知念从心起，名为觉行之门。诵在口中，即是音声之相。执相求理</w:t>
       </w:r>
       <w:r>
         <w:rPr>
@@ -2187,46 +2241,6 @@
           <w:shd w:val="pct15" w:color="auto" w:fill="FFFFFF"/>
           <w:lang w:eastAsia="zh-CN"/>
         </w:rPr>
-        <w:t>不在于言。因筌求鱼，得鱼忘筌。因言求意，得意忘言。既称念佛之名，须知念佛之道。若心无实，口诵空名。三毒内臻，人我填臆。将无明心不见佛。徒尔费功。且如诵之与念。义理悬殊。在口曰诵</w:t>
-      </w:r>
-      <w:r>
-        <w:rPr>
-          <w:rFonts w:hint="eastAsia"/>
-          <w:sz w:val="24"/>
-          <w:szCs w:val="24"/>
-          <w:shd w:val="pct15" w:color="auto" w:fill="FFFFFF"/>
-          <w:lang w:eastAsia="zh-CN"/>
-        </w:rPr>
-        <w:t>，</w:t>
-      </w:r>
-      <w:r>
-        <w:rPr>
-          <w:rFonts w:hint="eastAsia"/>
-          <w:sz w:val="24"/>
-          <w:szCs w:val="24"/>
-          <w:shd w:val="pct15" w:color="auto" w:fill="FFFFFF"/>
-          <w:lang w:eastAsia="zh-CN"/>
-        </w:rPr>
-        <w:t>在心曰念。故知念从心起，名为觉行之门。诵在口中，即是音声之相。执相求理</w:t>
-      </w:r>
-      <w:r>
-        <w:rPr>
-          <w:rFonts w:hint="eastAsia"/>
-          <w:sz w:val="24"/>
-          <w:szCs w:val="24"/>
-          <w:shd w:val="pct15" w:color="auto" w:fill="FFFFFF"/>
-          <w:lang w:eastAsia="zh-CN"/>
-        </w:rPr>
-        <w:t>，</w:t>
-      </w:r>
-      <w:r>
-        <w:rPr>
-          <w:rFonts w:hint="eastAsia"/>
-          <w:sz w:val="24"/>
-          <w:szCs w:val="24"/>
-          <w:shd w:val="pct15" w:color="auto" w:fill="FFFFFF"/>
-          <w:lang w:eastAsia="zh-CN"/>
-        </w:rPr>
         <w:t>终无是处。故知过去诸圣所修皆非外说。唯只推心。即心是众善之源。即心为万德之主。涅盘常乐由息心</w:t>
       </w:r>
       <w:r>
@@ -2297,19 +2311,7 @@
           <w:shd w:val="pct15" w:color="auto" w:fill="FFFFFF"/>
           <w:lang w:eastAsia="zh-CN"/>
         </w:rPr>
-        <w:t>。见有为则勤勤爱着。说无相则兀兀如迷。且贪现世之小慈。岂觉当来之大苦。此之修学徒自疲劳。背正归邪诳言获福。但能摄心内照。觉观外明。绝三毒永使销亡。闭六贼不令侵扰。自然恒沙功德、种种庄严、无数法门，一一成就，超凡证圣，目击非遥。</w:t>
-      </w:r>
-      <w:bookmarkStart w:id="0" w:name="_GoBack"/>
-      <w:bookmarkEnd w:id="0"/>
-      <w:r>
-        <w:rPr>
-          <w:rFonts w:hint="eastAsia"/>
-          <w:sz w:val="24"/>
-          <w:szCs w:val="24"/>
-          <w:shd w:val="pct15" w:color="auto" w:fill="FFFFFF"/>
-          <w:lang w:eastAsia="zh-CN"/>
-        </w:rPr>
-        <w:t>悟在须臾，何烦皓首。真门幽秘，宁可具陈。略述观心，详其少分。而说偈言。</w:t>
+        <w:t>。见有为则勤勤爱着。说无相则兀兀如迷。且贪现世之小慈。岂觉当来之大苦。此之修学徒自疲劳。背正归邪诳言获福。但能摄心内照。觉观外明。绝三毒永使销亡。闭六贼不令侵扰。自然恒沙功德、种种庄严、无数法门，一一成就，超凡证圣，目击非遥。悟在须臾，何烦皓首。真门幽秘，宁可具陈。略述观心，详其少分。而说偈言。</w:t>
       </w:r>
     </w:p>
     <w:p>
@@ -14484,7 +14486,7 @@
 </file>
 
 <file path=customXml/itemProps1.xml><?xml version="1.0" encoding="utf-8"?>
-<ds:datastoreItem xmlns:ds="http://schemas.openxmlformats.org/officeDocument/2006/customXml" ds:itemID="{0B1AAF1A-69F9-4E02-AC50-8BB4DFB53634}">
+<ds:datastoreItem xmlns:ds="http://schemas.openxmlformats.org/officeDocument/2006/customXml" ds:itemID="{B8F49879-8771-443F-AB5E-DE3CEAD7C5B0}">
   <ds:schemaRefs>
     <ds:schemaRef ds:uri="http://schemas.openxmlformats.org/officeDocument/2006/bibliography"/>
   </ds:schemaRefs>

</xml_diff>

<commit_message>
Site updated: 2022-05-17 20:14:59
</commit_message>
<xml_diff>
--- a/treasure/download/02续藏经-710部/新建文件夹/中国撰述诸宗著述部禅宗杂著-达磨大师破相论-梁-菩提达磨.docx
+++ b/treasure/download/02续藏经-710部/新建文件夹/中国撰述诸宗著述部禅宗杂著-达磨大师破相论-梁-菩提达磨.docx
@@ -48,6 +48,7 @@
     <w:p>
       <w:pPr>
         <w:spacing w:after="0" w:line="240" w:lineRule="auto"/>
+        <w:ind w:firstLineChars="200" w:firstLine="480"/>
         <w:jc w:val="both"/>
         <w:rPr>
           <w:sz w:val="24"/>
@@ -1105,7 +1106,18 @@
           <w:shd w:val="pct15" w:color="auto" w:fill="FFFFFF"/>
           <w:lang w:eastAsia="zh-CN"/>
         </w:rPr>
-        <w:t xml:space="preserve">　　问。经中所说。佛令众生修造伽蓝。铸写形像。烧香散花然灯。昼夜六时</w:t>
+        <w:t xml:space="preserve">　　</w:t>
+      </w:r>
+      <w:bookmarkStart w:id="0" w:name="_GoBack"/>
+      <w:r>
+        <w:rPr>
+          <w:rFonts w:hint="eastAsia"/>
+          <w:sz w:val="24"/>
+          <w:szCs w:val="24"/>
+          <w:shd w:val="pct15" w:color="auto" w:fill="FFFFFF"/>
+          <w:lang w:eastAsia="zh-CN"/>
+        </w:rPr>
+        <w:t>问。经中所说。佛令众生修造伽蓝。铸写形像。烧香散花然灯。昼夜六时</w:t>
       </w:r>
       <w:r>
         <w:rPr>
@@ -1992,19 +2004,7 @@
           <w:shd w:val="pct15" w:color="auto" w:fill="FFFFFF"/>
           <w:lang w:eastAsia="zh-CN"/>
         </w:rPr>
-        <w:t>名为礼拜。其相即法相也。世尊欲令世俗表谦下心。亦为礼拜。故须屈伏外身示内恭敬。举外明内。性相相应。</w:t>
-      </w:r>
-      <w:bookmarkStart w:id="0" w:name="_GoBack"/>
-      <w:bookmarkEnd w:id="0"/>
-      <w:r>
-        <w:rPr>
-          <w:rFonts w:hint="eastAsia"/>
-          <w:sz w:val="24"/>
-          <w:szCs w:val="24"/>
-          <w:shd w:val="pct15" w:color="auto" w:fill="FFFFFF"/>
-          <w:lang w:eastAsia="zh-CN"/>
-        </w:rPr>
-        <w:t>若复不行理法。唯执外求</w:t>
+        <w:t>名为礼拜。其相即法相也。世尊欲令世俗表谦下心。亦为礼拜。故须屈伏外身示内恭敬。举外明内。性相相应。若复不行理法。唯执外求</w:t>
       </w:r>
       <w:r>
         <w:rPr>
@@ -2018,6 +2018,7 @@
         <w:t>内。则放纵瞋痴常为恶业。外即空劳身相。诈现威仪。无惭于圣。徒诳于凡。不免轮回。岂成功德。</w:t>
       </w:r>
     </w:p>
+    <w:bookmarkEnd w:id="0"/>
     <w:p>
       <w:pPr>
         <w:spacing w:after="0" w:line="240" w:lineRule="auto"/>
@@ -14486,7 +14487,7 @@
 </file>
 
 <file path=customXml/itemProps1.xml><?xml version="1.0" encoding="utf-8"?>
-<ds:datastoreItem xmlns:ds="http://schemas.openxmlformats.org/officeDocument/2006/customXml" ds:itemID="{B8F49879-8771-443F-AB5E-DE3CEAD7C5B0}">
+<ds:datastoreItem xmlns:ds="http://schemas.openxmlformats.org/officeDocument/2006/customXml" ds:itemID="{B78F25F6-A21A-461D-A43B-09A90FE31FAD}">
   <ds:schemaRefs>
     <ds:schemaRef ds:uri="http://schemas.openxmlformats.org/officeDocument/2006/bibliography"/>
   </ds:schemaRefs>

</xml_diff>